<commit_message>
Dossier Word régénéré avec le chapitre modèle de données
Passe de 7 à 10 pages, 15 tableaux.

- chapitre 6 étendu : modèle conceptuel avec définition métier des entités,
  modèle logique, colonnes dont le choix mérite justification, contraintes
  portées par la base, normalisation et volumétrie
- D5-bis ajoutée au tableau des décisions, avec la mention explicite qu'elle
  corrige D5
- nouvelle section « mise en situation réelle » : les deux cartes importées,
  ce qu'elles ont invalidé, validé et révélé
- les photos des plats apparaissent désormais dans le reste à faire, comme
  écart assumé avec le cadrage
- deux tests d'intégration supplémentaires sur les suppléments
</commit_message>
<xml_diff>
--- a/docs/QResto-Dossier-de-projet.docx
+++ b/docs/QResto-Dossier-de-projet.docx
@@ -1439,7 +1439,7 @@
               <w:rPr>
                 <w:sz w:val="19"/>
               </w:rPr>
-              <w:t>Trois interfaces, base de données déployée</w:t>
+              <w:t>Quatre interfaces, base déployée en production, deux cartes réelles importées</w:t>
             </w:r>
           </w:p>
         </w:tc>
@@ -1492,7 +1492,7 @@
               <w:rPr>
                 <w:sz w:val="19"/>
               </w:rPr>
-              <w:t>Tests d'intégration passés, recette sur site à faire</w:t>
+              <w:t>Tests d'intégration et de bout en bout passés ; recette sur site à mener</w:t>
             </w:r>
           </w:p>
         </w:tc>
@@ -1555,6 +1555,19 @@
       <w:pPr>
         <w:spacing w:after="80"/>
       </w:pPr>
+    </w:p>
+    <w:p>
+      <w:pPr>
+        <w:spacing w:after="120"/>
+      </w:pPr>
+      <w:r>
+        <w:rPr>
+          <w:b w:val="0"/>
+          <w:i w:val="0"/>
+          <w:sz w:val="21"/>
+        </w:rPr>
+        <w:t>Vingt-trois décisions ont été prises à ce jour, dont une correction : D5-bis a rouvert D5 après que la carte réelle d'un restaurant cible eut invalidé l'hypothèse sur laquelle elle reposait. Sept décisions restent ouvertes ; trois d'entre elles attendent des observations de terrain.</w:t>
+      </w:r>
     </w:p>
     <w:p>
       <w:pPr>
@@ -1964,6 +1977,59 @@
                 <w:sz w:val="19"/>
               </w:rPr>
               <w:t>Certains restaurants ont des tailles, d'autres non : le schéma couvre le sur-ensemble. Un plat simple reçoit une déclinaison masquée par l'interface.</w:t>
+            </w:r>
+          </w:p>
+        </w:tc>
+      </w:tr>
+      <w:tr>
+        <w:tc>
+          <w:tcPr>
+            <w:tcW w:type="dxa" w:w="850"/>
+          </w:tcPr>
+          <w:p>
+            <w:pPr>
+              <w:spacing w:after="40"/>
+            </w:pPr>
+            <w:r/>
+            <w:r>
+              <w:rPr>
+                <w:sz w:val="19"/>
+              </w:rPr>
+              <w:t>D5-bis</w:t>
+            </w:r>
+          </w:p>
+        </w:tc>
+        <w:tc>
+          <w:tcPr>
+            <w:tcW w:type="dxa" w:w="2835"/>
+          </w:tcPr>
+          <w:p>
+            <w:pPr>
+              <w:spacing w:after="40"/>
+            </w:pPr>
+            <w:r/>
+            <w:r>
+              <w:rPr>
+                <w:sz w:val="19"/>
+              </w:rPr>
+              <w:t>Suppléments rattachés à la ligne de commande</w:t>
+            </w:r>
+          </w:p>
+        </w:tc>
+        <w:tc>
+          <w:tcPr>
+            <w:tcW w:type="dxa" w:w="5102"/>
+          </w:tcPr>
+          <w:p>
+            <w:pPr>
+              <w:spacing w:after="40"/>
+            </w:pPr>
+            <w:r/>
+            <w:r>
+              <w:rPr>
+                <w:sz w:val="19"/>
+              </w:rPr>
+              <w:t>Corrige D5. Les cartes réelles ont invalidé l'hypothèse « aucun restaurant cible n'a exprimé ce besoin » : les suppléments y sont partout, et sur les pizzas leur prix dépend de la taille. Traités comme des articles séparés, ils rendaient le ticket cuisine ambigu.</w:t>
             </w:r>
           </w:p>
         </w:tc>
@@ -3089,7 +3155,29 @@
           <w:i w:val="0"/>
           <w:sz w:val="21"/>
         </w:rPr>
-        <w:t>Dix tables. La chaîne principale est la suivante :</w:t>
+        <w:t>Onze tables, trente et un index, onze politiques de sécurité, quinze procédures et un déclencheur. Les éléments qui suivent sont extraits du schéma réellement déployé.</w:t>
+      </w:r>
+    </w:p>
+    <w:p>
+      <w:pPr>
+        <w:pStyle w:val="Heading2"/>
+        <w:spacing w:before="240" w:after="120"/>
+      </w:pPr>
+      <w:r>
+        <w:t>Modèle conceptuel</w:t>
+      </w:r>
+    </w:p>
+    <w:p>
+      <w:pPr>
+        <w:spacing w:after="120"/>
+      </w:pPr>
+      <w:r>
+        <w:rPr>
+          <w:b w:val="0"/>
+          <w:i w:val="0"/>
+          <w:sz w:val="21"/>
+        </w:rPr>
+        <w:t>La chaîne principale :</w:t>
       </w:r>
     </w:p>
     <w:p>
@@ -3103,7 +3191,7 @@
           <w:i w:val="0"/>
           <w:sz w:val="21"/>
         </w:rPr>
-        <w:t>restaurants  →  tables  →  sessions  →  commandes  →  lignes de commande</w:t>
+        <w:t>RESTAURANT  →  TABLE  →  SESSION  →  COMMANDE  →  LIGNE DE COMMANDE</w:t>
       </w:r>
     </w:p>
     <w:tbl>
@@ -3121,7 +3209,7 @@
       <w:tr>
         <w:tc>
           <w:tcPr>
-            <w:tcW w:type="dxa" w:w="2551"/>
+            <w:tcW w:type="dxa" w:w="1984"/>
             <w:shd w:val="clear" w:color="auto" w:fill="F3F4F6"/>
           </w:tcPr>
           <w:p>
@@ -3134,13 +3222,13 @@
                 <w:b/>
                 <w:sz w:val="19"/>
               </w:rPr>
-              <w:t>Table</w:t>
-            </w:r>
-          </w:p>
-        </w:tc>
-        <w:tc>
-          <w:tcPr>
-            <w:tcW w:type="dxa" w:w="6236"/>
+              <w:t>Entité</w:t>
+            </w:r>
+          </w:p>
+        </w:tc>
+        <w:tc>
+          <w:tcPr>
+            <w:tcW w:type="dxa" w:w="6803"/>
             <w:shd w:val="clear" w:color="auto" w:fill="F3F4F6"/>
           </w:tcPr>
           <w:p>
@@ -3153,7 +3241,7 @@
                 <w:b/>
                 <w:sz w:val="19"/>
               </w:rPr>
-              <w:t>Rôle</w:t>
+              <w:t>Définition métier</w:t>
             </w:r>
           </w:p>
         </w:tc>
@@ -3161,35 +3249,35 @@
       <w:tr>
         <w:tc>
           <w:tcPr>
-            <w:tcW w:type="dxa" w:w="2551"/>
-          </w:tcPr>
-          <w:p>
-            <w:pPr>
-              <w:spacing w:after="40"/>
-            </w:pPr>
-            <w:r/>
-            <w:r>
-              <w:rPr>
-                <w:sz w:val="19"/>
-              </w:rPr>
-              <w:t>restaurants</w:t>
-            </w:r>
-          </w:p>
-        </w:tc>
-        <w:tc>
-          <w:tcPr>
-            <w:tcW w:type="dxa" w:w="6236"/>
-          </w:tcPr>
-          <w:p>
-            <w:pPr>
-              <w:spacing w:after="40"/>
-            </w:pPr>
-            <w:r/>
-            <w:r>
-              <w:rPr>
-                <w:sz w:val="19"/>
-              </w:rPr>
-              <w:t>Établissement et ses paramètres de fonctionnement</w:t>
+            <w:tcW w:type="dxa" w:w="1984"/>
+          </w:tcPr>
+          <w:p>
+            <w:pPr>
+              <w:spacing w:after="40"/>
+            </w:pPr>
+            <w:r/>
+            <w:r>
+              <w:rPr>
+                <w:sz w:val="19"/>
+              </w:rPr>
+              <w:t>Restaurant</w:t>
+            </w:r>
+          </w:p>
+        </w:tc>
+        <w:tc>
+          <w:tcPr>
+            <w:tcW w:type="dxa" w:w="6803"/>
+          </w:tcPr>
+          <w:p>
+            <w:pPr>
+              <w:spacing w:after="40"/>
+            </w:pPr>
+            <w:r/>
+            <w:r>
+              <w:rPr>
+                <w:sz w:val="19"/>
+              </w:rPr>
+              <w:t>Établissement abonné au service, avec ses paramètres de fonctionnement</w:t>
             </w:r>
           </w:p>
         </w:tc>
@@ -3197,35 +3285,35 @@
       <w:tr>
         <w:tc>
           <w:tcPr>
-            <w:tcW w:type="dxa" w:w="2551"/>
-          </w:tcPr>
-          <w:p>
-            <w:pPr>
-              <w:spacing w:after="40"/>
-            </w:pPr>
-            <w:r/>
-            <w:r>
-              <w:rPr>
-                <w:sz w:val="19"/>
-              </w:rPr>
-              <w:t>tables_resto</w:t>
-            </w:r>
-          </w:p>
-        </w:tc>
-        <w:tc>
-          <w:tcPr>
-            <w:tcW w:type="dxa" w:w="6236"/>
-          </w:tcPr>
-          <w:p>
-            <w:pPr>
-              <w:spacing w:after="40"/>
-            </w:pPr>
-            <w:r/>
-            <w:r>
-              <w:rPr>
-                <w:sz w:val="19"/>
-              </w:rPr>
-              <w:t>Emplacement physique porteur du jeton encodé dans le QR code</w:t>
+            <w:tcW w:type="dxa" w:w="1984"/>
+          </w:tcPr>
+          <w:p>
+            <w:pPr>
+              <w:spacing w:after="40"/>
+            </w:pPr>
+            <w:r/>
+            <w:r>
+              <w:rPr>
+                <w:sz w:val="19"/>
+              </w:rPr>
+              <w:t>Table</w:t>
+            </w:r>
+          </w:p>
+        </w:tc>
+        <w:tc>
+          <w:tcPr>
+            <w:tcW w:type="dxa" w:w="6803"/>
+          </w:tcPr>
+          <w:p>
+            <w:pPr>
+              <w:spacing w:after="40"/>
+            </w:pPr>
+            <w:r/>
+            <w:r>
+              <w:rPr>
+                <w:sz w:val="19"/>
+              </w:rPr>
+              <w:t>Emplacement physique dans la salle, porteur du QR code</w:t>
             </w:r>
           </w:p>
         </w:tc>
@@ -3233,35 +3321,35 @@
       <w:tr>
         <w:tc>
           <w:tcPr>
-            <w:tcW w:type="dxa" w:w="2551"/>
-          </w:tcPr>
-          <w:p>
-            <w:pPr>
-              <w:spacing w:after="40"/>
-            </w:pPr>
-            <w:r/>
-            <w:r>
-              <w:rPr>
-                <w:sz w:val="19"/>
-              </w:rPr>
-              <w:t>categories</w:t>
-            </w:r>
-          </w:p>
-        </w:tc>
-        <w:tc>
-          <w:tcPr>
-            <w:tcW w:type="dxa" w:w="6236"/>
-          </w:tcPr>
-          <w:p>
-            <w:pPr>
-              <w:spacing w:after="40"/>
-            </w:pPr>
-            <w:r/>
-            <w:r>
-              <w:rPr>
-                <w:sz w:val="19"/>
-              </w:rPr>
-              <w:t>Regroupement de plats dans le menu</w:t>
+            <w:tcW w:type="dxa" w:w="1984"/>
+          </w:tcPr>
+          <w:p>
+            <w:pPr>
+              <w:spacing w:after="40"/>
+            </w:pPr>
+            <w:r/>
+            <w:r>
+              <w:rPr>
+                <w:sz w:val="19"/>
+              </w:rPr>
+              <w:t>Catégorie</w:t>
+            </w:r>
+          </w:p>
+        </w:tc>
+        <w:tc>
+          <w:tcPr>
+            <w:tcW w:type="dxa" w:w="6803"/>
+          </w:tcPr>
+          <w:p>
+            <w:pPr>
+              <w:spacing w:after="40"/>
+            </w:pPr>
+            <w:r/>
+            <w:r>
+              <w:rPr>
+                <w:sz w:val="19"/>
+              </w:rPr>
+              <w:t>Regroupement de plats dans la carte</w:t>
             </w:r>
           </w:p>
         </w:tc>
@@ -3269,35 +3357,35 @@
       <w:tr>
         <w:tc>
           <w:tcPr>
-            <w:tcW w:type="dxa" w:w="2551"/>
-          </w:tcPr>
-          <w:p>
-            <w:pPr>
-              <w:spacing w:after="40"/>
-            </w:pPr>
-            <w:r/>
-            <w:r>
-              <w:rPr>
-                <w:sz w:val="19"/>
-              </w:rPr>
-              <w:t>plats</w:t>
-            </w:r>
-          </w:p>
-        </w:tc>
-        <w:tc>
-          <w:tcPr>
-            <w:tcW w:type="dxa" w:w="6236"/>
-          </w:tcPr>
-          <w:p>
-            <w:pPr>
-              <w:spacing w:after="40"/>
-            </w:pPr>
-            <w:r/>
-            <w:r>
-              <w:rPr>
-                <w:sz w:val="19"/>
-              </w:rPr>
-              <w:t>Article du menu, en trois langues, avec sa disponibilité</w:t>
+            <w:tcW w:type="dxa" w:w="1984"/>
+          </w:tcPr>
+          <w:p>
+            <w:pPr>
+              <w:spacing w:after="40"/>
+            </w:pPr>
+            <w:r/>
+            <w:r>
+              <w:rPr>
+                <w:sz w:val="19"/>
+              </w:rPr>
+              <w:t>Plat</w:t>
+            </w:r>
+          </w:p>
+        </w:tc>
+        <w:tc>
+          <w:tcPr>
+            <w:tcW w:type="dxa" w:w="6803"/>
+          </w:tcPr>
+          <w:p>
+            <w:pPr>
+              <w:spacing w:after="40"/>
+            </w:pPr>
+            <w:r/>
+            <w:r>
+              <w:rPr>
+                <w:sz w:val="19"/>
+              </w:rPr>
+              <w:t>Article de la carte. Un supplément est un plat marqué comme tel</w:t>
             </w:r>
           </w:p>
         </w:tc>
@@ -3305,35 +3393,35 @@
       <w:tr>
         <w:tc>
           <w:tcPr>
-            <w:tcW w:type="dxa" w:w="2551"/>
-          </w:tcPr>
-          <w:p>
-            <w:pPr>
-              <w:spacing w:after="40"/>
-            </w:pPr>
-            <w:r/>
-            <w:r>
-              <w:rPr>
-                <w:sz w:val="19"/>
-              </w:rPr>
-              <w:t>variantes_plat</w:t>
-            </w:r>
-          </w:p>
-        </w:tc>
-        <w:tc>
-          <w:tcPr>
-            <w:tcW w:type="dxa" w:w="6236"/>
-          </w:tcPr>
-          <w:p>
-            <w:pPr>
-              <w:spacing w:after="40"/>
-            </w:pPr>
-            <w:r/>
-            <w:r>
-              <w:rPr>
-                <w:sz w:val="19"/>
-              </w:rPr>
-              <w:t>Déclinaison (taille, format) portant le prix</w:t>
+            <w:tcW w:type="dxa" w:w="1984"/>
+          </w:tcPr>
+          <w:p>
+            <w:pPr>
+              <w:spacing w:after="40"/>
+            </w:pPr>
+            <w:r/>
+            <w:r>
+              <w:rPr>
+                <w:sz w:val="19"/>
+              </w:rPr>
+              <w:t>Variante</w:t>
+            </w:r>
+          </w:p>
+        </w:tc>
+        <w:tc>
+          <w:tcPr>
+            <w:tcW w:type="dxa" w:w="6803"/>
+          </w:tcPr>
+          <w:p>
+            <w:pPr>
+              <w:spacing w:after="40"/>
+            </w:pPr>
+            <w:r/>
+            <w:r>
+              <w:rPr>
+                <w:sz w:val="19"/>
+              </w:rPr>
+              <w:t>Déclinaison d'un plat portant le prix</w:t>
             </w:r>
           </w:p>
         </w:tc>
@@ -3341,35 +3429,35 @@
       <w:tr>
         <w:tc>
           <w:tcPr>
-            <w:tcW w:type="dxa" w:w="2551"/>
-          </w:tcPr>
-          <w:p>
-            <w:pPr>
-              <w:spacing w:after="40"/>
-            </w:pPr>
-            <w:r/>
-            <w:r>
-              <w:rPr>
-                <w:sz w:val="19"/>
-              </w:rPr>
-              <w:t>sessions</w:t>
-            </w:r>
-          </w:p>
-        </w:tc>
-        <w:tc>
-          <w:tcPr>
-            <w:tcW w:type="dxa" w:w="6236"/>
-          </w:tcPr>
-          <w:p>
-            <w:pPr>
-              <w:spacing w:after="40"/>
-            </w:pPr>
-            <w:r/>
-            <w:r>
-              <w:rPr>
-                <w:sz w:val="19"/>
-              </w:rPr>
-              <w:t>Le couvert : unité de facturation</w:t>
+            <w:tcW w:type="dxa" w:w="1984"/>
+          </w:tcPr>
+          <w:p>
+            <w:pPr>
+              <w:spacing w:after="40"/>
+            </w:pPr>
+            <w:r/>
+            <w:r>
+              <w:rPr>
+                <w:sz w:val="19"/>
+              </w:rPr>
+              <w:t>Session</w:t>
+            </w:r>
+          </w:p>
+        </w:tc>
+        <w:tc>
+          <w:tcPr>
+            <w:tcW w:type="dxa" w:w="6803"/>
+          </w:tcPr>
+          <w:p>
+            <w:pPr>
+              <w:spacing w:after="40"/>
+            </w:pPr>
+            <w:r/>
+            <w:r>
+              <w:rPr>
+                <w:sz w:val="19"/>
+              </w:rPr>
+              <w:t>Le couvert : un groupe installé à une table, unité de facturation</w:t>
             </w:r>
           </w:p>
         </w:tc>
@@ -3377,35 +3465,35 @@
       <w:tr>
         <w:tc>
           <w:tcPr>
-            <w:tcW w:type="dxa" w:w="2551"/>
-          </w:tcPr>
-          <w:p>
-            <w:pPr>
-              <w:spacing w:after="40"/>
-            </w:pPr>
-            <w:r/>
-            <w:r>
-              <w:rPr>
-                <w:sz w:val="19"/>
-              </w:rPr>
-              <w:t>commandes</w:t>
-            </w:r>
-          </w:p>
-        </w:tc>
-        <w:tc>
-          <w:tcPr>
-            <w:tcW w:type="dxa" w:w="6236"/>
-          </w:tcPr>
-          <w:p>
-            <w:pPr>
-              <w:spacing w:after="40"/>
-            </w:pPr>
-            <w:r/>
-            <w:r>
-              <w:rPr>
-                <w:sz w:val="19"/>
-              </w:rPr>
-              <w:t>Un envoi effectué par un convive</w:t>
+            <w:tcW w:type="dxa" w:w="1984"/>
+          </w:tcPr>
+          <w:p>
+            <w:pPr>
+              <w:spacing w:after="40"/>
+            </w:pPr>
+            <w:r/>
+            <w:r>
+              <w:rPr>
+                <w:sz w:val="19"/>
+              </w:rPr>
+              <w:t>Commande</w:t>
+            </w:r>
+          </w:p>
+        </w:tc>
+        <w:tc>
+          <w:tcPr>
+            <w:tcW w:type="dxa" w:w="6803"/>
+          </w:tcPr>
+          <w:p>
+            <w:pPr>
+              <w:spacing w:after="40"/>
+            </w:pPr>
+            <w:r/>
+            <w:r>
+              <w:rPr>
+                <w:sz w:val="19"/>
+              </w:rPr>
+              <w:t>Un envoi effectué par un convive pendant une session</w:t>
             </w:r>
           </w:p>
         </w:tc>
@@ -3413,35 +3501,151 @@
       <w:tr>
         <w:tc>
           <w:tcPr>
-            <w:tcW w:type="dxa" w:w="2551"/>
-          </w:tcPr>
-          <w:p>
-            <w:pPr>
-              <w:spacing w:after="40"/>
-            </w:pPr>
-            <w:r/>
-            <w:r>
-              <w:rPr>
-                <w:sz w:val="19"/>
-              </w:rPr>
-              <w:t>lignes_commande</w:t>
-            </w:r>
-          </w:p>
-        </w:tc>
-        <w:tc>
-          <w:tcPr>
-            <w:tcW w:type="dxa" w:w="6236"/>
-          </w:tcPr>
-          <w:p>
-            <w:pPr>
-              <w:spacing w:after="40"/>
-            </w:pPr>
-            <w:r/>
-            <w:r>
-              <w:rPr>
-                <w:sz w:val="19"/>
-              </w:rPr>
-              <w:t>Déclinaison et quantité, avec le prix figé</w:t>
+            <w:tcW w:type="dxa" w:w="1984"/>
+          </w:tcPr>
+          <w:p>
+            <w:pPr>
+              <w:spacing w:after="40"/>
+            </w:pPr>
+            <w:r/>
+            <w:r>
+              <w:rPr>
+                <w:sz w:val="19"/>
+              </w:rPr>
+              <w:t>Ligne de commande</w:t>
+            </w:r>
+          </w:p>
+        </w:tc>
+        <w:tc>
+          <w:tcPr>
+            <w:tcW w:type="dxa" w:w="6803"/>
+          </w:tcPr>
+          <w:p>
+            <w:pPr>
+              <w:spacing w:after="40"/>
+            </w:pPr>
+            <w:r/>
+            <w:r>
+              <w:rPr>
+                <w:sz w:val="19"/>
+              </w:rPr>
+              <w:t>Une variante et sa quantité dans une commande</w:t>
+            </w:r>
+          </w:p>
+        </w:tc>
+      </w:tr>
+    </w:tbl>
+    <w:p>
+      <w:pPr>
+        <w:spacing w:after="80"/>
+      </w:pPr>
+    </w:p>
+    <w:p>
+      <w:pPr>
+        <w:spacing w:after="120"/>
+      </w:pPr>
+      <w:r>
+        <w:rPr>
+          <w:b/>
+          <w:i w:val="0"/>
+          <w:sz w:val="21"/>
+        </w:rPr>
+        <w:t>Trois associations méritent attention</w:t>
+      </w:r>
+    </w:p>
+    <w:p>
+      <w:pPr>
+        <w:pStyle w:val="ListBullet"/>
+        <w:spacing w:after="80"/>
+      </w:pPr>
+      <w:r>
+        <w:rPr>
+          <w:sz w:val="21"/>
+        </w:rPr>
+        <w:t>SESSION s'intercale entre TABLE et COMMANDE. C'est le cœur du modèle : sans elle, trois commandes d'une même table seraient trois objets sans lien, et le caissier devrait deviner quoi encaisser.</w:t>
+      </w:r>
+    </w:p>
+    <w:p>
+      <w:pPr>
+        <w:pStyle w:val="ListBullet"/>
+        <w:spacing w:after="80"/>
+      </w:pPr>
+      <w:r>
+        <w:rPr>
+          <w:sz w:val="21"/>
+        </w:rPr>
+        <w:t>LIGNE DE COMMANDE est en relation réflexive avec elle-même : une ligne « camembert » pointe vers la ligne « burger » qu'elle complète. Le ticket cuisine peut ainsi indiquer sur quel plat poser le supplément.</w:t>
+      </w:r>
+    </w:p>
+    <w:p>
+      <w:pPr>
+        <w:pStyle w:val="ListBullet"/>
+        <w:spacing w:after="80"/>
+      </w:pPr>
+      <w:r>
+        <w:rPr>
+          <w:sz w:val="21"/>
+        </w:rPr>
+        <w:t>PLAT et CATÉGORIE sont liés en plusieurs-à-plusieurs pour porter la portée d'un supplément : les fromages s'appliquent aux burgers et aux sandwichs, les garnitures sucrées aux crêpes.</w:t>
+      </w:r>
+    </w:p>
+    <w:p>
+      <w:pPr>
+        <w:pStyle w:val="Heading2"/>
+        <w:spacing w:before="240" w:after="120"/>
+      </w:pPr>
+      <w:r>
+        <w:t>Modèle logique</w:t>
+      </w:r>
+    </w:p>
+    <w:tbl>
+      <w:tblPr>
+        <w:tblStyle w:val="TableGrid"/>
+        <w:tblW w:type="auto" w:w="0"/>
+        <w:jc w:val="center"/>
+        <w:tblLayout w:type="fixed"/>
+        <w:tblLook w:firstColumn="1" w:firstRow="1" w:lastColumn="0" w:lastRow="0" w:noHBand="0" w:noVBand="1" w:val="04A0"/>
+      </w:tblPr>
+      <w:tblGrid>
+        <w:gridCol w:w="4703"/>
+        <w:gridCol w:w="4703"/>
+      </w:tblGrid>
+      <w:tr>
+        <w:tc>
+          <w:tcPr>
+            <w:tcW w:type="dxa" w:w="1984"/>
+            <w:shd w:val="clear" w:color="auto" w:fill="F3F4F6"/>
+          </w:tcPr>
+          <w:p>
+            <w:pPr>
+              <w:spacing w:after="40"/>
+            </w:pPr>
+            <w:r/>
+            <w:r>
+              <w:rPr>
+                <w:b/>
+                <w:sz w:val="19"/>
+              </w:rPr>
+              <w:t>Table</w:t>
+            </w:r>
+          </w:p>
+        </w:tc>
+        <w:tc>
+          <w:tcPr>
+            <w:tcW w:type="dxa" w:w="6803"/>
+            <w:shd w:val="clear" w:color="auto" w:fill="F3F4F6"/>
+          </w:tcPr>
+          <w:p>
+            <w:pPr>
+              <w:spacing w:after="40"/>
+            </w:pPr>
+            <w:r/>
+            <w:r>
+              <w:rPr>
+                <w:b/>
+                <w:sz w:val="19"/>
+              </w:rPr>
+              <w:t>Colonnes principales</w:t>
             </w:r>
           </w:p>
         </w:tc>
@@ -3449,35 +3653,35 @@
       <w:tr>
         <w:tc>
           <w:tcPr>
-            <w:tcW w:type="dxa" w:w="2551"/>
-          </w:tcPr>
-          <w:p>
-            <w:pPr>
-              <w:spacing w:after="40"/>
-            </w:pPr>
-            <w:r/>
-            <w:r>
-              <w:rPr>
-                <w:sz w:val="19"/>
-              </w:rPr>
-              <w:t>compteurs_journee</w:t>
-            </w:r>
-          </w:p>
-        </w:tc>
-        <w:tc>
-          <w:tcPr>
-            <w:tcW w:type="dxa" w:w="6236"/>
-          </w:tcPr>
-          <w:p>
-            <w:pPr>
-              <w:spacing w:after="40"/>
-            </w:pPr>
-            <w:r/>
-            <w:r>
-              <w:rPr>
-                <w:sz w:val="19"/>
-              </w:rPr>
-              <w:t>Numérotation séquentielle résistante à la concurrence</w:t>
+            <w:tcW w:type="dxa" w:w="1984"/>
+          </w:tcPr>
+          <w:p>
+            <w:pPr>
+              <w:spacing w:after="40"/>
+            </w:pPr>
+            <w:r/>
+            <w:r>
+              <w:rPr>
+                <w:sz w:val="19"/>
+              </w:rPr>
+              <w:t>restaurants</w:t>
+            </w:r>
+          </w:p>
+        </w:tc>
+        <w:tc>
+          <w:tcPr>
+            <w:tcW w:type="dxa" w:w="6803"/>
+          </w:tcPr>
+          <w:p>
+            <w:pPr>
+              <w:spacing w:after="40"/>
+            </w:pPr>
+            <w:r/>
+            <w:r>
+              <w:rPr>
+                <w:sz w:val="19"/>
+              </w:rPr>
+              <w:t>id, nom, ville, fuseau, fin_journee, validation_requise, code_table_requis, eta_active</w:t>
             </w:r>
           </w:p>
         </w:tc>
@@ -3485,7 +3689,331 @@
       <w:tr>
         <w:tc>
           <w:tcPr>
-            <w:tcW w:type="dxa" w:w="2551"/>
+            <w:tcW w:type="dxa" w:w="1984"/>
+          </w:tcPr>
+          <w:p>
+            <w:pPr>
+              <w:spacing w:after="40"/>
+            </w:pPr>
+            <w:r/>
+            <w:r>
+              <w:rPr>
+                <w:sz w:val="19"/>
+              </w:rPr>
+              <w:t>tables_resto</w:t>
+            </w:r>
+          </w:p>
+        </w:tc>
+        <w:tc>
+          <w:tcPr>
+            <w:tcW w:type="dxa" w:w="6803"/>
+          </w:tcPr>
+          <w:p>
+            <w:pPr>
+              <w:spacing w:after="40"/>
+            </w:pPr>
+            <w:r/>
+            <w:r>
+              <w:rPr>
+                <w:sz w:val="19"/>
+              </w:rPr>
+              <w:t>id, restaurant_id, numero, qr_token, active</w:t>
+            </w:r>
+          </w:p>
+        </w:tc>
+      </w:tr>
+      <w:tr>
+        <w:tc>
+          <w:tcPr>
+            <w:tcW w:type="dxa" w:w="1984"/>
+          </w:tcPr>
+          <w:p>
+            <w:pPr>
+              <w:spacing w:after="40"/>
+            </w:pPr>
+            <w:r/>
+            <w:r>
+              <w:rPr>
+                <w:sz w:val="19"/>
+              </w:rPr>
+              <w:t>categories</w:t>
+            </w:r>
+          </w:p>
+        </w:tc>
+        <w:tc>
+          <w:tcPr>
+            <w:tcW w:type="dxa" w:w="6803"/>
+          </w:tcPr>
+          <w:p>
+            <w:pPr>
+              <w:spacing w:after="40"/>
+            </w:pPr>
+            <w:r/>
+            <w:r>
+              <w:rPr>
+                <w:sz w:val="19"/>
+              </w:rPr>
+              <w:t>id, restaurant_id, nom_fr, nom_ar, nom_en, ordre</w:t>
+            </w:r>
+          </w:p>
+        </w:tc>
+      </w:tr>
+      <w:tr>
+        <w:tc>
+          <w:tcPr>
+            <w:tcW w:type="dxa" w:w="1984"/>
+          </w:tcPr>
+          <w:p>
+            <w:pPr>
+              <w:spacing w:after="40"/>
+            </w:pPr>
+            <w:r/>
+            <w:r>
+              <w:rPr>
+                <w:sz w:val="19"/>
+              </w:rPr>
+              <w:t>plats</w:t>
+            </w:r>
+          </w:p>
+        </w:tc>
+        <w:tc>
+          <w:tcPr>
+            <w:tcW w:type="dxa" w:w="6803"/>
+          </w:tcPr>
+          <w:p>
+            <w:pPr>
+              <w:spacing w:after="40"/>
+            </w:pPr>
+            <w:r/>
+            <w:r>
+              <w:rPr>
+                <w:sz w:val="19"/>
+              </w:rPr>
+              <w:t>id, restaurant_id, categorie_id, noms et descriptions trilingues, image_url, disponible, archive, est_supplement</w:t>
+            </w:r>
+          </w:p>
+        </w:tc>
+      </w:tr>
+      <w:tr>
+        <w:tc>
+          <w:tcPr>
+            <w:tcW w:type="dxa" w:w="1984"/>
+          </w:tcPr>
+          <w:p>
+            <w:pPr>
+              <w:spacing w:after="40"/>
+            </w:pPr>
+            <w:r/>
+            <w:r>
+              <w:rPr>
+                <w:sz w:val="19"/>
+              </w:rPr>
+              <w:t>variantes_plat</w:t>
+            </w:r>
+          </w:p>
+        </w:tc>
+        <w:tc>
+          <w:tcPr>
+            <w:tcW w:type="dxa" w:w="6803"/>
+          </w:tcPr>
+          <w:p>
+            <w:pPr>
+              <w:spacing w:after="40"/>
+            </w:pPr>
+            <w:r/>
+            <w:r>
+              <w:rPr>
+                <w:sz w:val="19"/>
+              </w:rPr>
+              <w:t>id, plat_id, libelles trilingues, prix, ordre</w:t>
+            </w:r>
+          </w:p>
+        </w:tc>
+      </w:tr>
+      <w:tr>
+        <w:tc>
+          <w:tcPr>
+            <w:tcW w:type="dxa" w:w="1984"/>
+          </w:tcPr>
+          <w:p>
+            <w:pPr>
+              <w:spacing w:after="40"/>
+            </w:pPr>
+            <w:r/>
+            <w:r>
+              <w:rPr>
+                <w:sz w:val="19"/>
+              </w:rPr>
+              <w:t>supplements_categories</w:t>
+            </w:r>
+          </w:p>
+        </w:tc>
+        <w:tc>
+          <w:tcPr>
+            <w:tcW w:type="dxa" w:w="6803"/>
+          </w:tcPr>
+          <w:p>
+            <w:pPr>
+              <w:spacing w:after="40"/>
+            </w:pPr>
+            <w:r/>
+            <w:r>
+              <w:rPr>
+                <w:sz w:val="19"/>
+              </w:rPr>
+              <w:t>supplement_id, categorie_id</w:t>
+            </w:r>
+          </w:p>
+        </w:tc>
+      </w:tr>
+      <w:tr>
+        <w:tc>
+          <w:tcPr>
+            <w:tcW w:type="dxa" w:w="1984"/>
+          </w:tcPr>
+          <w:p>
+            <w:pPr>
+              <w:spacing w:after="40"/>
+            </w:pPr>
+            <w:r/>
+            <w:r>
+              <w:rPr>
+                <w:sz w:val="19"/>
+              </w:rPr>
+              <w:t>sessions</w:t>
+            </w:r>
+          </w:p>
+        </w:tc>
+        <w:tc>
+          <w:tcPr>
+            <w:tcW w:type="dxa" w:w="6803"/>
+          </w:tcPr>
+          <w:p>
+            <w:pPr>
+              <w:spacing w:after="40"/>
+            </w:pPr>
+            <w:r/>
+            <w:r>
+              <w:rPr>
+                <w:sz w:val="19"/>
+              </w:rPr>
+              <w:t>id, restaurant_id, table_id, statut, journee, total, ouverte_le, activite_le, fermee_le</w:t>
+            </w:r>
+          </w:p>
+        </w:tc>
+      </w:tr>
+      <w:tr>
+        <w:tc>
+          <w:tcPr>
+            <w:tcW w:type="dxa" w:w="1984"/>
+          </w:tcPr>
+          <w:p>
+            <w:pPr>
+              <w:spacing w:after="40"/>
+            </w:pPr>
+            <w:r/>
+            <w:r>
+              <w:rPr>
+                <w:sz w:val="19"/>
+              </w:rPr>
+              <w:t>commandes</w:t>
+            </w:r>
+          </w:p>
+        </w:tc>
+        <w:tc>
+          <w:tcPr>
+            <w:tcW w:type="dxa" w:w="6803"/>
+          </w:tcPr>
+          <w:p>
+            <w:pPr>
+              <w:spacing w:after="40"/>
+            </w:pPr>
+            <w:r/>
+            <w:r>
+              <w:rPr>
+                <w:sz w:val="19"/>
+              </w:rPr>
+              <w:t>id, restaurant_id, session_id, numero, journee, statut, nom_convive, note, total, eta_min, eta_max, secret, imprimee_le, motif_annulation</w:t>
+            </w:r>
+          </w:p>
+        </w:tc>
+      </w:tr>
+      <w:tr>
+        <w:tc>
+          <w:tcPr>
+            <w:tcW w:type="dxa" w:w="1984"/>
+          </w:tcPr>
+          <w:p>
+            <w:pPr>
+              <w:spacing w:after="40"/>
+            </w:pPr>
+            <w:r/>
+            <w:r>
+              <w:rPr>
+                <w:sz w:val="19"/>
+              </w:rPr>
+              <w:t>lignes_commande</w:t>
+            </w:r>
+          </w:p>
+        </w:tc>
+        <w:tc>
+          <w:tcPr>
+            <w:tcW w:type="dxa" w:w="6803"/>
+          </w:tcPr>
+          <w:p>
+            <w:pPr>
+              <w:spacing w:after="40"/>
+            </w:pPr>
+            <w:r/>
+            <w:r>
+              <w:rPr>
+                <w:sz w:val="19"/>
+              </w:rPr>
+              <w:t>id, commande_id, variante_id, plat_id, quantite, prix_unitaire, libelle, parent_ligne_id</w:t>
+            </w:r>
+          </w:p>
+        </w:tc>
+      </w:tr>
+      <w:tr>
+        <w:tc>
+          <w:tcPr>
+            <w:tcW w:type="dxa" w:w="1984"/>
+          </w:tcPr>
+          <w:p>
+            <w:pPr>
+              <w:spacing w:after="40"/>
+            </w:pPr>
+            <w:r/>
+            <w:r>
+              <w:rPr>
+                <w:sz w:val="19"/>
+              </w:rPr>
+              <w:t>compteurs_journee</w:t>
+            </w:r>
+          </w:p>
+        </w:tc>
+        <w:tc>
+          <w:tcPr>
+            <w:tcW w:type="dxa" w:w="6803"/>
+          </w:tcPr>
+          <w:p>
+            <w:pPr>
+              <w:spacing w:after="40"/>
+            </w:pPr>
+            <w:r/>
+            <w:r>
+              <w:rPr>
+                <w:sz w:val="19"/>
+              </w:rPr>
+              <w:t>restaurant_id, journee, dernier_numero</w:t>
+            </w:r>
+          </w:p>
+        </w:tc>
+      </w:tr>
+      <w:tr>
+        <w:tc>
+          <w:tcPr>
+            <w:tcW w:type="dxa" w:w="1984"/>
           </w:tcPr>
           <w:p>
             <w:pPr>
@@ -3502,18 +4030,18 @@
         </w:tc>
         <w:tc>
           <w:tcPr>
-            <w:tcW w:type="dxa" w:w="6236"/>
-          </w:tcPr>
-          <w:p>
-            <w:pPr>
-              <w:spacing w:after="40"/>
-            </w:pPr>
-            <w:r/>
-            <w:r>
-              <w:rPr>
-                <w:sz w:val="19"/>
-              </w:rPr>
-              <w:t>Trace des impressions, annulations et encaissements</w:t>
+            <w:tcW w:type="dxa" w:w="6803"/>
+          </w:tcPr>
+          <w:p>
+            <w:pPr>
+              <w:spacing w:after="40"/>
+            </w:pPr>
+            <w:r/>
+            <w:r>
+              <w:rPr>
+                <w:sz w:val="19"/>
+              </w:rPr>
+              <w:t>id, restaurant_id, commande_id, session_id, action, detail, acteur, cree_le</w:t>
             </w:r>
           </w:p>
         </w:tc>
@@ -3530,55 +4058,895 @@
         <w:spacing w:before="240" w:after="120"/>
       </w:pPr>
       <w:r>
-        <w:t>Choix de conception notables</w:t>
+        <w:t>Colonnes dont le choix mérite justification</w:t>
+      </w:r>
+    </w:p>
+    <w:tbl>
+      <w:tblPr>
+        <w:tblStyle w:val="TableGrid"/>
+        <w:tblW w:type="auto" w:w="0"/>
+        <w:jc w:val="center"/>
+        <w:tblLayout w:type="fixed"/>
+        <w:tblLook w:firstColumn="1" w:firstRow="1" w:lastColumn="0" w:lastRow="0" w:noHBand="0" w:noVBand="1" w:val="04A0"/>
+      </w:tblPr>
+      <w:tblGrid>
+        <w:gridCol w:w="4703"/>
+        <w:gridCol w:w="4703"/>
+      </w:tblGrid>
+      <w:tr>
+        <w:tc>
+          <w:tcPr>
+            <w:tcW w:type="dxa" w:w="2551"/>
+            <w:shd w:val="clear" w:color="auto" w:fill="F3F4F6"/>
+          </w:tcPr>
+          <w:p>
+            <w:pPr>
+              <w:spacing w:after="40"/>
+            </w:pPr>
+            <w:r/>
+            <w:r>
+              <w:rPr>
+                <w:b/>
+                <w:sz w:val="19"/>
+              </w:rPr>
+              <w:t>Colonne</w:t>
+            </w:r>
+          </w:p>
+        </w:tc>
+        <w:tc>
+          <w:tcPr>
+            <w:tcW w:type="dxa" w:w="6236"/>
+            <w:shd w:val="clear" w:color="auto" w:fill="F3F4F6"/>
+          </w:tcPr>
+          <w:p>
+            <w:pPr>
+              <w:spacing w:after="40"/>
+            </w:pPr>
+            <w:r/>
+            <w:r>
+              <w:rPr>
+                <w:b/>
+                <w:sz w:val="19"/>
+              </w:rPr>
+              <w:t>Pourquoi elle existe sous cette forme</w:t>
+            </w:r>
+          </w:p>
+        </w:tc>
+      </w:tr>
+      <w:tr>
+        <w:tc>
+          <w:tcPr>
+            <w:tcW w:type="dxa" w:w="2551"/>
+          </w:tcPr>
+          <w:p>
+            <w:pPr>
+              <w:spacing w:after="40"/>
+            </w:pPr>
+            <w:r/>
+            <w:r>
+              <w:rPr>
+                <w:sz w:val="19"/>
+              </w:rPr>
+              <w:t>restaurants.fin_journee</w:t>
+            </w:r>
+          </w:p>
+        </w:tc>
+        <w:tc>
+          <w:tcPr>
+            <w:tcW w:type="dxa" w:w="6236"/>
+          </w:tcPr>
+          <w:p>
+            <w:pPr>
+              <w:spacing w:after="40"/>
+            </w:pPr>
+            <w:r/>
+            <w:r>
+              <w:rPr>
+                <w:sz w:val="19"/>
+              </w:rPr>
+              <w:t>La journée d'exploitation se termine à 4 h, pas à minuit : un restaurant ouvert jusqu'à 1 h verrait sinon son service coupé en deux.</w:t>
+            </w:r>
+          </w:p>
+        </w:tc>
+      </w:tr>
+      <w:tr>
+        <w:tc>
+          <w:tcPr>
+            <w:tcW w:type="dxa" w:w="2551"/>
+          </w:tcPr>
+          <w:p>
+            <w:pPr>
+              <w:spacing w:after="40"/>
+            </w:pPr>
+            <w:r/>
+            <w:r>
+              <w:rPr>
+                <w:sz w:val="19"/>
+              </w:rPr>
+              <w:t>tables_resto.qr_token</w:t>
+            </w:r>
+          </w:p>
+        </w:tc>
+        <w:tc>
+          <w:tcPr>
+            <w:tcW w:type="dxa" w:w="6236"/>
+          </w:tcPr>
+          <w:p>
+            <w:pPr>
+              <w:spacing w:after="40"/>
+            </w:pPr>
+            <w:r/>
+            <w:r>
+              <w:rPr>
+                <w:sz w:val="19"/>
+              </w:rPr>
+              <w:t>Le QR encode un identifiant aléatoire, jamais le numéro de table : un numéro serait devinable.</w:t>
+            </w:r>
+          </w:p>
+        </w:tc>
+      </w:tr>
+      <w:tr>
+        <w:tc>
+          <w:tcPr>
+            <w:tcW w:type="dxa" w:w="2551"/>
+          </w:tcPr>
+          <w:p>
+            <w:pPr>
+              <w:spacing w:after="40"/>
+            </w:pPr>
+            <w:r/>
+            <w:r>
+              <w:rPr>
+                <w:sz w:val="19"/>
+              </w:rPr>
+              <w:t>plats.archive</w:t>
+            </w:r>
+          </w:p>
+        </w:tc>
+        <w:tc>
+          <w:tcPr>
+            <w:tcW w:type="dxa" w:w="6236"/>
+          </w:tcPr>
+          <w:p>
+            <w:pPr>
+              <w:spacing w:after="40"/>
+            </w:pPr>
+            <w:r/>
+            <w:r>
+              <w:rPr>
+                <w:sz w:val="19"/>
+              </w:rPr>
+              <w:t>Un plat retiré de la carte n'est jamais supprimé : les commandes passées le référencent encore.</w:t>
+            </w:r>
+          </w:p>
+        </w:tc>
+      </w:tr>
+      <w:tr>
+        <w:tc>
+          <w:tcPr>
+            <w:tcW w:type="dxa" w:w="2551"/>
+          </w:tcPr>
+          <w:p>
+            <w:pPr>
+              <w:spacing w:after="40"/>
+            </w:pPr>
+            <w:r/>
+            <w:r>
+              <w:rPr>
+                <w:sz w:val="19"/>
+              </w:rPr>
+              <w:t>plats.est_supplement</w:t>
+            </w:r>
+          </w:p>
+        </w:tc>
+        <w:tc>
+          <w:tcPr>
+            <w:tcW w:type="dxa" w:w="6236"/>
+          </w:tcPr>
+          <w:p>
+            <w:pPr>
+              <w:spacing w:after="40"/>
+            </w:pPr>
+            <w:r/>
+            <w:r>
+              <w:rPr>
+                <w:sz w:val="19"/>
+              </w:rPr>
+              <w:t>Un supplément est un plat marqué comme tel : il hérite des déclinaisons, de la disponibilité et du prix figé sans table dédiée.</w:t>
+            </w:r>
+          </w:p>
+        </w:tc>
+      </w:tr>
+      <w:tr>
+        <w:tc>
+          <w:tcPr>
+            <w:tcW w:type="dxa" w:w="2551"/>
+          </w:tcPr>
+          <w:p>
+            <w:pPr>
+              <w:spacing w:after="40"/>
+            </w:pPr>
+            <w:r/>
+            <w:r>
+              <w:rPr>
+                <w:sz w:val="19"/>
+              </w:rPr>
+              <w:t>variantes_plat.prix</w:t>
+            </w:r>
+          </w:p>
+        </w:tc>
+        <w:tc>
+          <w:tcPr>
+            <w:tcW w:type="dxa" w:w="6236"/>
+          </w:tcPr>
+          <w:p>
+            <w:pPr>
+              <w:spacing w:after="40"/>
+            </w:pPr>
+            <w:r/>
+            <w:r>
+              <w:rPr>
+                <w:sz w:val="19"/>
+              </w:rPr>
+              <w:t>Le prix vit sur la déclinaison, jamais sur le plat. Garder les deux créerait deux chemins de lecture et des incohérences.</w:t>
+            </w:r>
+          </w:p>
+        </w:tc>
+      </w:tr>
+      <w:tr>
+        <w:tc>
+          <w:tcPr>
+            <w:tcW w:type="dxa" w:w="2551"/>
+          </w:tcPr>
+          <w:p>
+            <w:pPr>
+              <w:spacing w:after="40"/>
+            </w:pPr>
+            <w:r/>
+            <w:r>
+              <w:rPr>
+                <w:sz w:val="19"/>
+              </w:rPr>
+              <w:t>commandes.secret</w:t>
+            </w:r>
+          </w:p>
+        </w:tc>
+        <w:tc>
+          <w:tcPr>
+            <w:tcW w:type="dxa" w:w="6236"/>
+          </w:tcPr>
+          <w:p>
+            <w:pPr>
+              <w:spacing w:after="40"/>
+            </w:pPr>
+            <w:r/>
+            <w:r>
+              <w:rPr>
+                <w:sz w:val="19"/>
+              </w:rPr>
+              <w:t>Seul moyen pour le client de suivre sa commande sans exposer celles des autres tables.</w:t>
+            </w:r>
+          </w:p>
+        </w:tc>
+      </w:tr>
+      <w:tr>
+        <w:tc>
+          <w:tcPr>
+            <w:tcW w:type="dxa" w:w="2551"/>
+          </w:tcPr>
+          <w:p>
+            <w:pPr>
+              <w:spacing w:after="40"/>
+            </w:pPr>
+            <w:r/>
+            <w:r>
+              <w:rPr>
+                <w:sz w:val="19"/>
+              </w:rPr>
+              <w:t>commandes.imprimee_le</w:t>
+            </w:r>
+          </w:p>
+        </w:tc>
+        <w:tc>
+          <w:tcPr>
+            <w:tcW w:type="dxa" w:w="6236"/>
+          </w:tcPr>
+          <w:p>
+            <w:pPr>
+              <w:spacing w:after="40"/>
+            </w:pPr>
+            <w:r/>
+            <w:r>
+              <w:rPr>
+                <w:sz w:val="19"/>
+              </w:rPr>
+              <w:t>L'impression du ticket est l'acte d'engagement de production.</w:t>
+            </w:r>
+          </w:p>
+        </w:tc>
+      </w:tr>
+      <w:tr>
+        <w:tc>
+          <w:tcPr>
+            <w:tcW w:type="dxa" w:w="2551"/>
+          </w:tcPr>
+          <w:p>
+            <w:pPr>
+              <w:spacing w:after="40"/>
+            </w:pPr>
+            <w:r/>
+            <w:r>
+              <w:rPr>
+                <w:sz w:val="19"/>
+              </w:rPr>
+              <w:t>lignes_commande.prix_unitaire</w:t>
+            </w:r>
+          </w:p>
+        </w:tc>
+        <w:tc>
+          <w:tcPr>
+            <w:tcW w:type="dxa" w:w="6236"/>
+          </w:tcPr>
+          <w:p>
+            <w:pPr>
+              <w:spacing w:after="40"/>
+            </w:pPr>
+            <w:r/>
+            <w:r>
+              <w:rPr>
+                <w:sz w:val="19"/>
+              </w:rPr>
+              <w:t>Prix figé à la vente. Ce n'est pas une copie du prix courant : sans lui, une hausse de tarif fausserait rétroactivement tout l'historique.</w:t>
+            </w:r>
+          </w:p>
+        </w:tc>
+      </w:tr>
+      <w:tr>
+        <w:tc>
+          <w:tcPr>
+            <w:tcW w:type="dxa" w:w="2551"/>
+          </w:tcPr>
+          <w:p>
+            <w:pPr>
+              <w:spacing w:after="40"/>
+            </w:pPr>
+            <w:r/>
+            <w:r>
+              <w:rPr>
+                <w:sz w:val="19"/>
+              </w:rPr>
+              <w:t>lignes_commande.libelle</w:t>
+            </w:r>
+          </w:p>
+        </w:tc>
+        <w:tc>
+          <w:tcPr>
+            <w:tcW w:type="dxa" w:w="6236"/>
+          </w:tcPr>
+          <w:p>
+            <w:pPr>
+              <w:spacing w:after="40"/>
+            </w:pPr>
+            <w:r/>
+            <w:r>
+              <w:rPr>
+                <w:sz w:val="19"/>
+              </w:rPr>
+              <w:t>Instantané du libellé. Un ticket réimprimé doit rester identique à l'original, même si le plat a été renommé depuis.</w:t>
+            </w:r>
+          </w:p>
+        </w:tc>
+      </w:tr>
+      <w:tr>
+        <w:tc>
+          <w:tcPr>
+            <w:tcW w:type="dxa" w:w="2551"/>
+          </w:tcPr>
+          <w:p>
+            <w:pPr>
+              <w:spacing w:after="40"/>
+            </w:pPr>
+            <w:r/>
+            <w:r>
+              <w:rPr>
+                <w:sz w:val="19"/>
+              </w:rPr>
+              <w:t>compteurs_journee</w:t>
+            </w:r>
+          </w:p>
+        </w:tc>
+        <w:tc>
+          <w:tcPr>
+            <w:tcW w:type="dxa" w:w="6236"/>
+          </w:tcPr>
+          <w:p>
+            <w:pPr>
+              <w:spacing w:after="40"/>
+            </w:pPr>
+            <w:r/>
+            <w:r>
+              <w:rPr>
+                <w:sz w:val="19"/>
+              </w:rPr>
+              <w:t>Sans compteur dédié, deux commandes simultanées obtiendraient le même numéro.</w:t>
+            </w:r>
+          </w:p>
+        </w:tc>
+      </w:tr>
+    </w:tbl>
+    <w:p>
+      <w:pPr>
+        <w:spacing w:after="80"/>
+      </w:pPr>
+    </w:p>
+    <w:p>
+      <w:pPr>
+        <w:pStyle w:val="Heading2"/>
+        <w:spacing w:before="240" w:after="120"/>
+      </w:pPr>
+      <w:r>
+        <w:t>Contraintes portées par la base</w:t>
       </w:r>
     </w:p>
     <w:p>
       <w:pPr>
-        <w:pStyle w:val="ListBullet"/>
-        <w:spacing w:after="80"/>
+        <w:spacing w:after="120"/>
       </w:pPr>
       <w:r>
         <w:rPr>
+          <w:b w:val="0"/>
+          <w:i w:val="0"/>
           <w:sz w:val="21"/>
         </w:rPr>
-        <w:t>Le prix et le libellé sont figés dans la ligne de commande : un changement de tarif ne réécrit pas l'historique, et un ticket réimprimé reste identique à l'original.</w:t>
+        <w:t>Ces règles ne sont pas écrites dans le navigateur. Le client n'étant pas authentifié, tout contrôle placé côté interface serait contournable.</w:t>
+      </w:r>
+    </w:p>
+    <w:tbl>
+      <w:tblPr>
+        <w:tblStyle w:val="TableGrid"/>
+        <w:tblW w:type="auto" w:w="0"/>
+        <w:jc w:val="center"/>
+        <w:tblLayout w:type="fixed"/>
+        <w:tblLook w:firstColumn="1" w:firstRow="1" w:lastColumn="0" w:lastRow="0" w:noHBand="0" w:noVBand="1" w:val="04A0"/>
+      </w:tblPr>
+      <w:tblGrid>
+        <w:gridCol w:w="4703"/>
+        <w:gridCol w:w="4703"/>
+      </w:tblGrid>
+      <w:tr>
+        <w:tc>
+          <w:tcPr>
+            <w:tcW w:type="dxa" w:w="3118"/>
+            <w:shd w:val="clear" w:color="auto" w:fill="F3F4F6"/>
+          </w:tcPr>
+          <w:p>
+            <w:pPr>
+              <w:spacing w:after="40"/>
+            </w:pPr>
+            <w:r/>
+            <w:r>
+              <w:rPr>
+                <w:b/>
+                <w:sz w:val="19"/>
+              </w:rPr>
+              <w:t>Contrainte</w:t>
+            </w:r>
+          </w:p>
+        </w:tc>
+        <w:tc>
+          <w:tcPr>
+            <w:tcW w:type="dxa" w:w="5669"/>
+            <w:shd w:val="clear" w:color="auto" w:fill="F3F4F6"/>
+          </w:tcPr>
+          <w:p>
+            <w:pPr>
+              <w:spacing w:after="40"/>
+            </w:pPr>
+            <w:r/>
+            <w:r>
+              <w:rPr>
+                <w:b/>
+                <w:sz w:val="19"/>
+              </w:rPr>
+              <w:t>Ce qu'elle garantit</w:t>
+            </w:r>
+          </w:p>
+        </w:tc>
+      </w:tr>
+      <w:tr>
+        <w:tc>
+          <w:tcPr>
+            <w:tcW w:type="dxa" w:w="3118"/>
+          </w:tcPr>
+          <w:p>
+            <w:pPr>
+              <w:spacing w:after="40"/>
+            </w:pPr>
+            <w:r/>
+            <w:r>
+              <w:rPr>
+                <w:sz w:val="19"/>
+              </w:rPr>
+              <w:t>Index unique partiel sur les sessions ouvertes</w:t>
+            </w:r>
+          </w:p>
+        </w:tc>
+        <w:tc>
+          <w:tcPr>
+            <w:tcW w:type="dxa" w:w="5669"/>
+          </w:tcPr>
+          <w:p>
+            <w:pPr>
+              <w:spacing w:after="40"/>
+            </w:pPr>
+            <w:r/>
+            <w:r>
+              <w:rPr>
+                <w:sz w:val="19"/>
+              </w:rPr>
+              <w:t>Une table n'a qu'une seule session ouverte : deux convives tombent forcément sur la même addition.</w:t>
+            </w:r>
+          </w:p>
+        </w:tc>
+      </w:tr>
+      <w:tr>
+        <w:tc>
+          <w:tcPr>
+            <w:tcW w:type="dxa" w:w="3118"/>
+          </w:tcPr>
+          <w:p>
+            <w:pPr>
+              <w:spacing w:after="40"/>
+            </w:pPr>
+            <w:r/>
+            <w:r>
+              <w:rPr>
+                <w:sz w:val="19"/>
+              </w:rPr>
+              <w:t>Unicité du numéro par restaurant et par journée</w:t>
+            </w:r>
+          </w:p>
+        </w:tc>
+        <w:tc>
+          <w:tcPr>
+            <w:tcW w:type="dxa" w:w="5669"/>
+          </w:tcPr>
+          <w:p>
+            <w:pPr>
+              <w:spacing w:after="40"/>
+            </w:pPr>
+            <w:r/>
+            <w:r>
+              <w:rPr>
+                <w:sz w:val="19"/>
+              </w:rPr>
+              <w:t>Pas de doublon de numéro de commande dans une journée.</w:t>
+            </w:r>
+          </w:p>
+        </w:tc>
+      </w:tr>
+      <w:tr>
+        <w:tc>
+          <w:tcPr>
+            <w:tcW w:type="dxa" w:w="3118"/>
+          </w:tcPr>
+          <w:p>
+            <w:pPr>
+              <w:spacing w:after="40"/>
+            </w:pPr>
+            <w:r/>
+            <w:r>
+              <w:rPr>
+                <w:sz w:val="19"/>
+              </w:rPr>
+              <w:t>Contraintes de domaine sur les statuts</w:t>
+            </w:r>
+          </w:p>
+        </w:tc>
+        <w:tc>
+          <w:tcPr>
+            <w:tcW w:type="dxa" w:w="5669"/>
+          </w:tcPr>
+          <w:p>
+            <w:pPr>
+              <w:spacing w:after="40"/>
+            </w:pPr>
+            <w:r/>
+            <w:r>
+              <w:rPr>
+                <w:sz w:val="19"/>
+              </w:rPr>
+              <w:t>Aucun état hors des machines à états définies.</w:t>
+            </w:r>
+          </w:p>
+        </w:tc>
+      </w:tr>
+      <w:tr>
+        <w:tc>
+          <w:tcPr>
+            <w:tcW w:type="dxa" w:w="3118"/>
+          </w:tcPr>
+          <w:p>
+            <w:pPr>
+              <w:spacing w:after="40"/>
+            </w:pPr>
+            <w:r/>
+            <w:r>
+              <w:rPr>
+                <w:sz w:val="19"/>
+              </w:rPr>
+              <w:t>Déclencheur sur les suppléments</w:t>
+            </w:r>
+          </w:p>
+        </w:tc>
+        <w:tc>
+          <w:tcPr>
+            <w:tcW w:type="dxa" w:w="5669"/>
+          </w:tcPr>
+          <w:p>
+            <w:pPr>
+              <w:spacing w:after="40"/>
+            </w:pPr>
+            <w:r/>
+            <w:r>
+              <w:rPr>
+                <w:sz w:val="19"/>
+              </w:rPr>
+              <w:t>Un supplément ne se commande pas seul, un plat ne se rattache pas à un plat, et un supplément n'en porte pas un autre.</w:t>
+            </w:r>
+          </w:p>
+        </w:tc>
+      </w:tr>
+      <w:tr>
+        <w:tc>
+          <w:tcPr>
+            <w:tcW w:type="dxa" w:w="3118"/>
+          </w:tcPr>
+          <w:p>
+            <w:pPr>
+              <w:spacing w:after="40"/>
+            </w:pPr>
+            <w:r/>
+            <w:r>
+              <w:rPr>
+                <w:sz w:val="19"/>
+              </w:rPr>
+              <w:t>Suppressions restreintes</w:t>
+            </w:r>
+          </w:p>
+        </w:tc>
+        <w:tc>
+          <w:tcPr>
+            <w:tcW w:type="dxa" w:w="5669"/>
+          </w:tcPr>
+          <w:p>
+            <w:pPr>
+              <w:spacing w:after="40"/>
+            </w:pPr>
+            <w:r/>
+            <w:r>
+              <w:rPr>
+                <w:sz w:val="19"/>
+              </w:rPr>
+              <w:t>On ne supprime pas une table qui a servi, ni une déclinaison déjà commandée.</w:t>
+            </w:r>
+          </w:p>
+        </w:tc>
+      </w:tr>
+    </w:tbl>
+    <w:p>
+      <w:pPr>
+        <w:spacing w:after="80"/>
+      </w:pPr>
+    </w:p>
+    <w:p>
+      <w:pPr>
+        <w:pStyle w:val="Heading2"/>
+        <w:spacing w:before="240" w:after="120"/>
+      </w:pPr>
+      <w:r>
+        <w:t>Normalisation</w:t>
       </w:r>
     </w:p>
     <w:p>
       <w:pPr>
-        <w:pStyle w:val="ListBullet"/>
-        <w:spacing w:after="80"/>
+        <w:spacing w:after="120"/>
       </w:pPr>
       <w:r>
         <w:rPr>
+          <w:b w:val="0"/>
+          <w:i w:val="0"/>
           <w:sz w:val="21"/>
         </w:rPr>
-        <w:t>Un index unique partiel garantit au niveau de la base qu'une table n'a qu'une seule session ouverte. La règle n'est pas confiée au code applicatif.</w:t>
+        <w:t>Le schéma est en troisième forme normale, avec trois dénormalisations assumées.</w:t>
+      </w:r>
+    </w:p>
+    <w:tbl>
+      <w:tblPr>
+        <w:tblStyle w:val="TableGrid"/>
+        <w:tblW w:type="auto" w:w="0"/>
+        <w:jc w:val="center"/>
+        <w:tblLayout w:type="fixed"/>
+        <w:tblLook w:firstColumn="1" w:firstRow="1" w:lastColumn="0" w:lastRow="0" w:noHBand="0" w:noVBand="1" w:val="04A0"/>
+      </w:tblPr>
+      <w:tblGrid>
+        <w:gridCol w:w="4703"/>
+        <w:gridCol w:w="4703"/>
+      </w:tblGrid>
+      <w:tr>
+        <w:tc>
+          <w:tcPr>
+            <w:tcW w:type="dxa" w:w="2551"/>
+            <w:shd w:val="clear" w:color="auto" w:fill="F3F4F6"/>
+          </w:tcPr>
+          <w:p>
+            <w:pPr>
+              <w:spacing w:after="40"/>
+            </w:pPr>
+            <w:r/>
+            <w:r>
+              <w:rPr>
+                <w:b/>
+                <w:sz w:val="19"/>
+              </w:rPr>
+              <w:t>Champ</w:t>
+            </w:r>
+          </w:p>
+        </w:tc>
+        <w:tc>
+          <w:tcPr>
+            <w:tcW w:type="dxa" w:w="6236"/>
+            <w:shd w:val="clear" w:color="auto" w:fill="F3F4F6"/>
+          </w:tcPr>
+          <w:p>
+            <w:pPr>
+              <w:spacing w:after="40"/>
+            </w:pPr>
+            <w:r/>
+            <w:r>
+              <w:rPr>
+                <w:b/>
+                <w:sz w:val="19"/>
+              </w:rPr>
+              <w:t>Justification</w:t>
+            </w:r>
+          </w:p>
+        </w:tc>
+      </w:tr>
+      <w:tr>
+        <w:tc>
+          <w:tcPr>
+            <w:tcW w:type="dxa" w:w="2551"/>
+          </w:tcPr>
+          <w:p>
+            <w:pPr>
+              <w:spacing w:after="40"/>
+            </w:pPr>
+            <w:r/>
+            <w:r>
+              <w:rPr>
+                <w:sz w:val="19"/>
+              </w:rPr>
+              <w:t>sessions.total, commandes.total</w:t>
+            </w:r>
+          </w:p>
+        </w:tc>
+        <w:tc>
+          <w:tcPr>
+            <w:tcW w:type="dxa" w:w="6236"/>
+          </w:tcPr>
+          <w:p>
+            <w:pPr>
+              <w:spacing w:after="40"/>
+            </w:pPr>
+            <w:r/>
+            <w:r>
+              <w:rPr>
+                <w:sz w:val="19"/>
+              </w:rPr>
+              <w:t>Le poste caisse affiche des montants en continu ; les recalculer à chaque rafraîchissement serait coûteux et inutile.</w:t>
+            </w:r>
+          </w:p>
+        </w:tc>
+      </w:tr>
+      <w:tr>
+        <w:tc>
+          <w:tcPr>
+            <w:tcW w:type="dxa" w:w="2551"/>
+          </w:tcPr>
+          <w:p>
+            <w:pPr>
+              <w:spacing w:after="40"/>
+            </w:pPr>
+            <w:r/>
+            <w:r>
+              <w:rPr>
+                <w:sz w:val="19"/>
+              </w:rPr>
+              <w:t>lignes_commande.plat_id</w:t>
+            </w:r>
+          </w:p>
+        </w:tc>
+        <w:tc>
+          <w:tcPr>
+            <w:tcW w:type="dxa" w:w="6236"/>
+          </w:tcPr>
+          <w:p>
+            <w:pPr>
+              <w:spacing w:after="40"/>
+            </w:pPr>
+            <w:r/>
+            <w:r>
+              <w:rPr>
+                <w:sz w:val="19"/>
+              </w:rPr>
+              <w:t>Déductible via la déclinaison, mais les statistiques par plat exigeraient sinon une jointure de plus sur la table la plus volumineuse.</w:t>
+            </w:r>
+          </w:p>
+        </w:tc>
+      </w:tr>
+      <w:tr>
+        <w:tc>
+          <w:tcPr>
+            <w:tcW w:type="dxa" w:w="2551"/>
+          </w:tcPr>
+          <w:p>
+            <w:pPr>
+              <w:spacing w:after="40"/>
+            </w:pPr>
+            <w:r/>
+            <w:r>
+              <w:rPr>
+                <w:sz w:val="19"/>
+              </w:rPr>
+              <w:t>lignes_commande.libelle</w:t>
+            </w:r>
+          </w:p>
+        </w:tc>
+        <w:tc>
+          <w:tcPr>
+            <w:tcW w:type="dxa" w:w="6236"/>
+          </w:tcPr>
+          <w:p>
+            <w:pPr>
+              <w:spacing w:after="40"/>
+            </w:pPr>
+            <w:r/>
+            <w:r>
+              <w:rPr>
+                <w:sz w:val="19"/>
+              </w:rPr>
+              <w:t>Ce n'est pas une duplication mais un instantané : le ticket doit rester identique même si le plat est renommé.</w:t>
+            </w:r>
+          </w:p>
+        </w:tc>
+      </w:tr>
+    </w:tbl>
+    <w:p>
+      <w:pPr>
+        <w:spacing w:after="80"/>
+      </w:pPr>
+    </w:p>
+    <w:p>
+      <w:pPr>
+        <w:pStyle w:val="Heading2"/>
+        <w:spacing w:before="240" w:after="120"/>
+      </w:pPr>
+      <w:r>
+        <w:t>Volumétrie</w:t>
       </w:r>
     </w:p>
     <w:p>
       <w:pPr>
-        <w:pStyle w:val="ListBullet"/>
-        <w:spacing w:after="80"/>
+        <w:spacing w:after="120"/>
       </w:pPr>
       <w:r>
         <w:rPr>
+          <w:b w:val="0"/>
+          <w:i w:val="0"/>
           <w:sz w:val="21"/>
         </w:rPr>
-        <w:t>Un plat retiré du menu est archivé, jamais supprimé : les commandes passées le référencent encore.</w:t>
-      </w:r>
-    </w:p>
-    <w:p>
-      <w:pPr>
-        <w:pStyle w:val="ListBullet"/>
-        <w:spacing w:after="80"/>
-      </w:pPr>
-      <w:r>
-        <w:rPr>
-          <w:sz w:val="21"/>
-        </w:rPr>
-        <w:t>Chaque commande porte un secret, seul moyen pour le client de suivre la sienne sans voir celles des autres tables.</w:t>
+        <w:t>Moins de cinq cent mille lignes par an et par restaurant, dont l'essentiel en lignes de commande et en journal d'audit. Aucune contrainte de volumétrie : le plan gratuit couvre plusieurs années d'exploitation pour plusieurs établissements.</w:t>
       </w:r>
     </w:p>
     <w:p>
@@ -4707,6 +6075,112 @@
           </w:p>
         </w:tc>
       </w:tr>
+      <w:tr>
+        <w:tc>
+          <w:tcPr>
+            <w:tcW w:type="dxa" w:w="2551"/>
+          </w:tcPr>
+          <w:p>
+            <w:pPr>
+              <w:spacing w:after="40"/>
+            </w:pPr>
+            <w:r/>
+            <w:r>
+              <w:rPr>
+                <w:sz w:val="19"/>
+              </w:rPr>
+              <w:t>Supplément commandé seul</w:t>
+            </w:r>
+          </w:p>
+        </w:tc>
+        <w:tc>
+          <w:tcPr>
+            <w:tcW w:type="dxa" w:w="3118"/>
+          </w:tcPr>
+          <w:p>
+            <w:pPr>
+              <w:spacing w:after="40"/>
+            </w:pPr>
+            <w:r/>
+            <w:r>
+              <w:rPr>
+                <w:sz w:val="19"/>
+              </w:rPr>
+              <w:t>Camembert sans plat</w:t>
+            </w:r>
+          </w:p>
+        </w:tc>
+        <w:tc>
+          <w:tcPr>
+            <w:tcW w:type="dxa" w:w="3118"/>
+          </w:tcPr>
+          <w:p>
+            <w:pPr>
+              <w:spacing w:after="40"/>
+            </w:pPr>
+            <w:r/>
+            <w:r>
+              <w:rPr>
+                <w:sz w:val="19"/>
+              </w:rPr>
+              <w:t>Rejeté</w:t>
+            </w:r>
+          </w:p>
+        </w:tc>
+      </w:tr>
+      <w:tr>
+        <w:tc>
+          <w:tcPr>
+            <w:tcW w:type="dxa" w:w="2551"/>
+          </w:tcPr>
+          <w:p>
+            <w:pPr>
+              <w:spacing w:after="40"/>
+            </w:pPr>
+            <w:r/>
+            <w:r>
+              <w:rPr>
+                <w:sz w:val="19"/>
+              </w:rPr>
+              <w:t>Plat servant de supplément</w:t>
+            </w:r>
+          </w:p>
+        </w:tc>
+        <w:tc>
+          <w:tcPr>
+            <w:tcW w:type="dxa" w:w="3118"/>
+          </w:tcPr>
+          <w:p>
+            <w:pPr>
+              <w:spacing w:after="40"/>
+            </w:pPr>
+            <w:r/>
+            <w:r>
+              <w:rPr>
+                <w:sz w:val="19"/>
+              </w:rPr>
+              <w:t>Burger rattaché à un burger</w:t>
+            </w:r>
+          </w:p>
+        </w:tc>
+        <w:tc>
+          <w:tcPr>
+            <w:tcW w:type="dxa" w:w="3118"/>
+          </w:tcPr>
+          <w:p>
+            <w:pPr>
+              <w:spacing w:after="40"/>
+            </w:pPr>
+            <w:r/>
+            <w:r>
+              <w:rPr>
+                <w:sz w:val="19"/>
+              </w:rPr>
+              <w:t>Rejeté</w:t>
+            </w:r>
+          </w:p>
+        </w:tc>
+      </w:tr>
     </w:tbl>
     <w:p>
       <w:pPr>
@@ -4733,6 +6207,64 @@
           <w:sz w:val="21"/>
         </w:rPr>
         <w:t>Le parcours complet a été déroulé : scan du QR, composition du panier avec déclinaisons, saisie du prénom et d'une remarque, envoi. La commande est apparue sur le poste caisse sans rafraîchissement, groupée par table. L'impression a fait passer la commande en cuisine, et le téléphone du client a reflété le changement. Le cycle s'est achevé par la mise en statut prête, puis servie, puis l'encaissement de la table pour 4 050 DA.</w:t>
+      </w:r>
+    </w:p>
+    <w:p>
+      <w:pPr>
+        <w:pStyle w:val="Heading2"/>
+        <w:spacing w:before="240" w:after="120"/>
+      </w:pPr>
+      <w:r>
+        <w:t>Mise en situation réelle</w:t>
+      </w:r>
+    </w:p>
+    <w:p>
+      <w:pPr>
+        <w:spacing w:after="120"/>
+      </w:pPr>
+      <w:r>
+        <w:rPr>
+          <w:b w:val="0"/>
+          <w:i w:val="0"/>
+          <w:sz w:val="21"/>
+        </w:rPr>
+        <w:t>Deux cartes de restaurants d'Aïn Benian ont été relevées et importées : Black &amp; Silver, soixante-douze plats sur treize catégories, et Spicy Max, trente-huit plats sur sept catégories. Cette confrontation au réel a produit trois enseignements.</w:t>
+      </w:r>
+    </w:p>
+    <w:p>
+      <w:pPr>
+        <w:pStyle w:val="ListBullet"/>
+        <w:spacing w:after="80"/>
+      </w:pPr>
+      <w:r>
+        <w:rPr>
+          <w:sz w:val="21"/>
+        </w:rPr>
+        <w:t>Elle a invalidé une décision : les suppléments, écartés au cadrage faute de besoin exprimé, sont présents sur les deux cartes. D5-bis a corrigé le modèle.</w:t>
+      </w:r>
+    </w:p>
+    <w:p>
+      <w:pPr>
+        <w:pStyle w:val="ListBullet"/>
+        <w:spacing w:after="80"/>
+      </w:pPr>
+      <w:r>
+        <w:rPr>
+          <w:sz w:val="21"/>
+        </w:rPr>
+        <w:t>Elle a validé les déclinaisons : pizzas en deux tailles, tacos en deux formats, burgers à prix unique — les trois cas coexistent sur une même carte.</w:t>
+      </w:r>
+    </w:p>
+    <w:p>
+      <w:pPr>
+        <w:pStyle w:val="ListBullet"/>
+        <w:spacing w:after="80"/>
+      </w:pPr>
+      <w:r>
+        <w:rPr>
+          <w:sz w:val="21"/>
+        </w:rPr>
+        <w:t>Elle a révélé le seul écart avec le cadrage encore ouvert : les photos des plats, annoncées comme l'une des quatre fonctionnalités retenues, ne sont pas livrées. Les sources publiques ne fournissent que quelques visuels basse définition, insuffisants et dont la republication demanderait l'accord des établissements.</w:t>
       </w:r>
     </w:p>
     <w:p>
@@ -5262,11 +6794,90 @@
           </w:p>
         </w:tc>
       </w:tr>
+      <w:tr>
+        <w:tc>
+          <w:tcPr>
+            <w:tcW w:type="dxa" w:w="850"/>
+          </w:tcPr>
+          <w:p>
+            <w:pPr>
+              <w:spacing w:after="40"/>
+            </w:pPr>
+            <w:r/>
+            <w:r>
+              <w:rPr>
+                <w:sz w:val="19"/>
+              </w:rPr>
+              <w:t>—</w:t>
+            </w:r>
+          </w:p>
+        </w:tc>
+        <w:tc>
+          <w:tcPr>
+            <w:tcW w:type="dxa" w:w="2835"/>
+          </w:tcPr>
+          <w:p>
+            <w:pPr>
+              <w:spacing w:after="40"/>
+            </w:pPr>
+            <w:r/>
+            <w:r>
+              <w:rPr>
+                <w:sz w:val="19"/>
+              </w:rPr>
+              <w:t>Photos des plats</w:t>
+            </w:r>
+          </w:p>
+        </w:tc>
+        <w:tc>
+          <w:tcPr>
+            <w:tcW w:type="dxa" w:w="5102"/>
+          </w:tcPr>
+          <w:p>
+            <w:pPr>
+              <w:spacing w:after="40"/>
+            </w:pPr>
+            <w:r/>
+            <w:r>
+              <w:rPr>
+                <w:sz w:val="19"/>
+              </w:rPr>
+              <w:t>Fonctionnalité annoncée au cadrage, non livrée : les sources publiques sont insuffisantes et leur republication demanderait l'accord des établissements</w:t>
+            </w:r>
+          </w:p>
+        </w:tc>
+      </w:tr>
     </w:tbl>
     <w:p>
       <w:pPr>
         <w:spacing w:after="80"/>
       </w:pPr>
+    </w:p>
+    <w:p>
+      <w:pPr>
+        <w:spacing w:after="120"/>
+      </w:pPr>
+      <w:r>
+        <w:rPr>
+          <w:b/>
+          <w:i w:val="0"/>
+          <w:sz w:val="21"/>
+        </w:rPr>
+        <w:t>Trois de ces décisions dépendent d'observations de terrain</w:t>
+      </w:r>
+    </w:p>
+    <w:p>
+      <w:pPr>
+        <w:spacing w:after="120"/>
+      </w:pPr>
+      <w:r>
+        <w:rPr>
+          <w:b w:val="0"/>
+          <w:i w:val="0"/>
+          <w:sz w:val="21"/>
+        </w:rPr>
+        <w:t>D12, D13 et D14 portent sur la coupure d'internet en service, la panne d'imprimante et la maintenance du menu. Les trancher depuis un bureau produirait des hypothèses, pas des décisions. Une fiche d'observation a été préparée pour la première visite, où chaque ligne relevée alimente une décision précise.</w:t>
+      </w:r>
     </w:p>
     <w:p>
       <w:pPr>

</xml_diff>